<commit_message>
Docx writer: pen math structure control runs in marked content
Penning only the glyph runs of a marked equation rendered as a
segmented band: the spacing around groups and operators belongs to no
m:r, so it stayed bare. Word keeps the formatting of a structure's
non-glyph parts in a control run (m:ctrlPr inside the structure's
property element) and pens it when an equation is highlighted by hand.
highlightMathRuns now does the same: every structure's m:ctrlPr takes
the ambient highlight, synthesizing the property element when the
converters omitted it (they emit no empty m:sSupPr and friends), and
merging into an existing w:rPr rather than duplicating it. Marked
equations now highlight continuously, matching Word's native pen.

Tests: docx writer golden regenerated with penned control runs.
</commit_message>
<xml_diff>
--- a/test/docx/golden/mark_math.docx
+++ b/test/docx/golden/mark_math.docx
@@ -14,6 +14,13 @@
       </w:r>
       <m:oMath>
         <m:sSup>
+          <m:sSupPr>
+            <m:ctrlPr>
+              <w:rPr>
+                <w:highlight w:val="yellow"/>
+              </w:rPr>
+            </m:ctrlPr>
+          </m:sSupPr>
           <m:e>
             <m:r>
               <w:rPr>

</xml_diff>

<commit_message>
Docx writer: review fixes for the math pen.
Add acc (texmath emits m:acc for \hat{x}; a marked accent rendered
with a bare control run) and fix the pre/prePr entry to sPre/sPrePr
(m:pre does not exist). Store the structure names and derive the
m:<name>Pr, place the highlight inside an existing w:rPr at its
position in rPrTagOrder, rename the prefix helper's pre parameter to
pfx, check the w: prefix where the highlight is picked out of the
text properties, and extend the golden input (operators, n-ary,
fraction, root).
</commit_message>
<xml_diff>
--- a/test/docx/golden/mark_math.docx
+++ b/test/docx/golden/mark_math.docx
@@ -82,6 +82,183 @@
     <w:p>
       <w:pPr>
         <w:pStyle w:val="FirstParagraph"/>
+      </w:pPr>
+      <m:oMath>
+        <m:acc>
+          <m:accPr>
+            <m:chr m:val="̂"/>
+            <m:ctrlPr>
+              <w:rPr>
+                <w:highlight w:val="yellow"/>
+              </w:rPr>
+            </m:ctrlPr>
+          </m:accPr>
+          <m:e>
+            <m:r>
+              <w:rPr>
+                <w:highlight w:val="yellow"/>
+              </w:rPr>
+              <m:t>x</m:t>
+            </m:r>
+          </m:e>
+        </m:acc>
+      </m:oMath>
+    </w:p>
+    <w:p>
+      <w:pPr>
+        <w:pStyle w:val="BodyText"/>
+      </w:pPr>
+      <m:oMath>
+        <m:r>
+          <m:rPr>
+            <m:sty m:val="p"/>
+          </m:rPr>
+          <w:rPr>
+            <w:highlight w:val="yellow"/>
+          </w:rPr>
+          <m:t>sin</m:t>
+        </m:r>
+        <m:r>
+          <w:rPr>
+            <w:highlight w:val="yellow"/>
+          </w:rPr>
+          <m:t>x</m:t>
+        </m:r>
+        <m:r>
+          <m:rPr>
+            <m:sty m:val="p"/>
+          </m:rPr>
+          <w:rPr>
+            <w:highlight w:val="yellow"/>
+          </w:rPr>
+          <m:t>+</m:t>
+        </m:r>
+        <m:nary>
+          <m:naryPr>
+            <m:chr m:val="∑"/>
+            <m:limLoc m:val="undOvr"/>
+            <m:subHide m:val="off"/>
+            <m:supHide m:val="off"/>
+            <m:ctrlPr>
+              <w:rPr>
+                <w:highlight w:val="yellow"/>
+              </w:rPr>
+            </m:ctrlPr>
+          </m:naryPr>
+          <m:sub>
+            <m:r>
+              <w:rPr>
+                <w:highlight w:val="yellow"/>
+              </w:rPr>
+              <m:t>i</m:t>
+            </m:r>
+            <m:r>
+              <m:rPr>
+                <m:sty m:val="p"/>
+              </m:rPr>
+              <w:rPr>
+                <w:highlight w:val="yellow"/>
+              </w:rPr>
+              <m:t>=</m:t>
+            </m:r>
+            <m:r>
+              <w:rPr>
+                <w:highlight w:val="yellow"/>
+              </w:rPr>
+              <m:t>1</m:t>
+            </m:r>
+          </m:sub>
+          <m:sup>
+            <m:r>
+              <w:rPr>
+                <w:highlight w:val="yellow"/>
+              </w:rPr>
+              <m:t>n</m:t>
+            </m:r>
+          </m:sup>
+          <m:e>
+            <m:r>
+              <w:rPr>
+                <w:highlight w:val="yellow"/>
+              </w:rPr>
+              <m:t>i</m:t>
+            </m:r>
+          </m:e>
+        </m:nary>
+        <m:r>
+          <m:rPr>
+            <m:sty m:val="p"/>
+          </m:rPr>
+          <w:rPr>
+            <w:highlight w:val="yellow"/>
+          </w:rPr>
+          <m:t>+</m:t>
+        </m:r>
+        <m:f>
+          <m:fPr>
+            <m:type m:val="bar"/>
+            <m:ctrlPr>
+              <w:rPr>
+                <w:highlight w:val="yellow"/>
+              </w:rPr>
+            </m:ctrlPr>
+          </m:fPr>
+          <m:num>
+            <m:r>
+              <w:rPr>
+                <w:highlight w:val="yellow"/>
+              </w:rPr>
+              <m:t>a</m:t>
+            </m:r>
+          </m:num>
+          <m:den>
+            <m:r>
+              <w:rPr>
+                <w:highlight w:val="yellow"/>
+              </w:rPr>
+              <m:t>b</m:t>
+            </m:r>
+          </m:den>
+        </m:f>
+        <m:r>
+          <m:rPr>
+            <m:sty m:val="p"/>
+          </m:rPr>
+          <w:rPr>
+            <w:highlight w:val="yellow"/>
+          </w:rPr>
+          <m:t>+</m:t>
+        </m:r>
+        <m:rad>
+          <m:radPr>
+            <m:ctrlPr>
+              <w:rPr>
+                <w:highlight w:val="yellow"/>
+              </w:rPr>
+            </m:ctrlPr>
+          </m:radPr>
+          <m:deg>
+            <m:r>
+              <w:rPr>
+                <w:highlight w:val="yellow"/>
+              </w:rPr>
+              <m:t>3</m:t>
+            </m:r>
+          </m:deg>
+          <m:e>
+            <m:r>
+              <w:rPr>
+                <w:highlight w:val="yellow"/>
+              </w:rPr>
+              <m:t>x</m:t>
+            </m:r>
+          </m:e>
+        </m:rad>
+      </m:oMath>
+    </w:p>
+    <w:p>
+      <w:pPr>
+        <w:pStyle w:val="BodyText"/>
       </w:pPr>
       <w:r>
         <w:t xml:space="preserve">unmarked </w:t>

</xml_diff>